<commit_message>
adding release report, checksums
</commit_message>
<xml_diff>
--- a/Documentation/Checklist_Release_VECTO_3.3.0.1432.docx
+++ b/Documentation/Checklist_Release_VECTO_3.3.0.1432.docx
@@ -4943,7 +4943,7 @@
             </w:rPr>
             <w:id w:val="775679042"/>
             <w14:checkbox>
-              <w14:checked w14:val="0"/>
+              <w14:checked w14:val="1"/>
               <w14:checkedState w14:val="2612" w14:font="MS Gothic"/>
               <w14:uncheckedState w14:val="2610" w14:font="MS Gothic"/>
             </w14:checkbox>
@@ -4965,7 +4965,7 @@
                   <w:rPr>
                     <w:rFonts w:ascii="MS Gothic" w:eastAsia="MS Gothic" w:hAnsi="MS Gothic" w:cs="Arial" w:hint="eastAsia"/>
                   </w:rPr>
-                  <w:t>☐</w:t>
+                  <w:t>☒</w:t>
                 </w:r>
               </w:p>
             </w:tc>
@@ -5001,7 +5001,7 @@
             </w:rPr>
             <w:id w:val="670453380"/>
             <w14:checkbox>
-              <w14:checked w14:val="0"/>
+              <w14:checked w14:val="1"/>
               <w14:checkedState w14:val="2612" w14:font="MS Gothic"/>
               <w14:uncheckedState w14:val="2610" w14:font="MS Gothic"/>
             </w14:checkbox>
@@ -5023,7 +5023,7 @@
                   <w:rPr>
                     <w:rFonts w:ascii="MS Gothic" w:eastAsia="MS Gothic" w:hAnsi="MS Gothic" w:cs="Arial" w:hint="eastAsia"/>
                   </w:rPr>
-                  <w:t>☐</w:t>
+                  <w:t>☒</w:t>
                 </w:r>
               </w:p>
             </w:tc>
@@ -5100,7 +5100,7 @@
             </w:rPr>
             <w:id w:val="855547320"/>
             <w14:checkbox>
-              <w14:checked w14:val="0"/>
+              <w14:checked w14:val="1"/>
               <w14:checkedState w14:val="2612" w14:font="MS Gothic"/>
               <w14:uncheckedState w14:val="2610" w14:font="MS Gothic"/>
             </w14:checkbox>
@@ -5122,7 +5122,7 @@
                   <w:rPr>
                     <w:rFonts w:ascii="MS Gothic" w:eastAsia="MS Gothic" w:hAnsi="MS Gothic" w:cs="Arial" w:hint="eastAsia"/>
                   </w:rPr>
-                  <w:t>☐</w:t>
+                  <w:t>☒</w:t>
                 </w:r>
               </w:p>
             </w:tc>
@@ -5163,7 +5163,7 @@
             </w:rPr>
             <w:id w:val="-999029216"/>
             <w14:checkbox>
-              <w14:checked w14:val="0"/>
+              <w14:checked w14:val="1"/>
               <w14:checkedState w14:val="2612" w14:font="MS Gothic"/>
               <w14:uncheckedState w14:val="2610" w14:font="MS Gothic"/>
             </w14:checkbox>
@@ -5185,7 +5185,7 @@
                   <w:rPr>
                     <w:rFonts w:ascii="MS Gothic" w:eastAsia="MS Gothic" w:hAnsi="MS Gothic" w:cs="Arial" w:hint="eastAsia"/>
                   </w:rPr>
-                  <w:t>☐</w:t>
+                  <w:t>☒</w:t>
                 </w:r>
               </w:p>
             </w:tc>
@@ -5231,7 +5231,7 @@
             </w:rPr>
             <w:id w:val="-1286423710"/>
             <w14:checkbox>
-              <w14:checked w14:val="0"/>
+              <w14:checked w14:val="1"/>
               <w14:checkedState w14:val="2612" w14:font="MS Gothic"/>
               <w14:uncheckedState w14:val="2610" w14:font="MS Gothic"/>
             </w14:checkbox>
@@ -5253,7 +5253,7 @@
                   <w:rPr>
                     <w:rFonts w:ascii="MS Gothic" w:eastAsia="MS Gothic" w:hAnsi="MS Gothic" w:cs="Arial" w:hint="eastAsia"/>
                   </w:rPr>
-                  <w:t>☐</w:t>
+                  <w:t>☒</w:t>
                 </w:r>
               </w:p>
             </w:tc>
@@ -5323,7 +5323,7 @@
             </w:rPr>
             <w:id w:val="-1127541570"/>
             <w14:checkbox>
-              <w14:checked w14:val="0"/>
+              <w14:checked w14:val="1"/>
               <w14:checkedState w14:val="2612" w14:font="MS Gothic"/>
               <w14:uncheckedState w14:val="2610" w14:font="MS Gothic"/>
             </w14:checkbox>
@@ -5345,7 +5345,7 @@
                   <w:rPr>
                     <w:rFonts w:ascii="MS Gothic" w:eastAsia="MS Gothic" w:hAnsi="MS Gothic" w:cs="Arial" w:hint="eastAsia"/>
                   </w:rPr>
-                  <w:t>☐</w:t>
+                  <w:t>☒</w:t>
                 </w:r>
               </w:p>
             </w:tc>
@@ -5383,7 +5383,7 @@
             </w:rPr>
             <w:id w:val="274994606"/>
             <w14:checkbox>
-              <w14:checked w14:val="0"/>
+              <w14:checked w14:val="1"/>
               <w14:checkedState w14:val="2612" w14:font="MS Gothic"/>
               <w14:uncheckedState w14:val="2610" w14:font="MS Gothic"/>
             </w14:checkbox>
@@ -5405,7 +5405,7 @@
                   <w:rPr>
                     <w:rFonts w:ascii="MS Gothic" w:eastAsia="MS Gothic" w:hAnsi="MS Gothic" w:cs="Arial" w:hint="eastAsia"/>
                   </w:rPr>
-                  <w:t>☐</w:t>
+                  <w:t>☒</w:t>
                 </w:r>
               </w:p>
             </w:tc>
@@ -5454,7 +5454,7 @@
             </w:rPr>
             <w:id w:val="-14611377"/>
             <w14:checkbox>
-              <w14:checked w14:val="0"/>
+              <w14:checked w14:val="1"/>
               <w14:checkedState w14:val="2612" w14:font="MS Gothic"/>
               <w14:uncheckedState w14:val="2610" w14:font="MS Gothic"/>
             </w14:checkbox>
@@ -5476,7 +5476,7 @@
                   <w:rPr>
                     <w:rFonts w:ascii="MS Gothic" w:eastAsia="MS Gothic" w:hAnsi="MS Gothic" w:cs="Arial" w:hint="eastAsia"/>
                   </w:rPr>
-                  <w:t>☐</w:t>
+                  <w:t>☒</w:t>
                 </w:r>
               </w:p>
             </w:tc>
@@ -5525,7 +5525,7 @@
             </w:rPr>
             <w:id w:val="1956435620"/>
             <w14:checkbox>
-              <w14:checked w14:val="0"/>
+              <w14:checked w14:val="1"/>
               <w14:checkedState w14:val="2612" w14:font="MS Gothic"/>
               <w14:uncheckedState w14:val="2610" w14:font="MS Gothic"/>
             </w14:checkbox>
@@ -5547,7 +5547,7 @@
                   <w:rPr>
                     <w:rFonts w:ascii="MS Gothic" w:eastAsia="MS Gothic" w:hAnsi="MS Gothic" w:cs="Arial" w:hint="eastAsia"/>
                   </w:rPr>
-                  <w:t>☐</w:t>
+                  <w:t>☒</w:t>
                 </w:r>
               </w:p>
             </w:tc>
@@ -5585,7 +5585,7 @@
             </w:rPr>
             <w:id w:val="-867984556"/>
             <w14:checkbox>
-              <w14:checked w14:val="0"/>
+              <w14:checked w14:val="1"/>
               <w14:checkedState w14:val="2612" w14:font="MS Gothic"/>
               <w14:uncheckedState w14:val="2610" w14:font="MS Gothic"/>
             </w14:checkbox>
@@ -5607,7 +5607,7 @@
                   <w:rPr>
                     <w:rFonts w:ascii="MS Gothic" w:eastAsia="MS Gothic" w:hAnsi="MS Gothic" w:cs="Arial" w:hint="eastAsia"/>
                   </w:rPr>
-                  <w:t>☐</w:t>
+                  <w:t>☒</w:t>
                 </w:r>
               </w:p>
             </w:tc>
@@ -5650,7 +5650,7 @@
             </w:rPr>
             <w:id w:val="1169446134"/>
             <w14:checkbox>
-              <w14:checked w14:val="0"/>
+              <w14:checked w14:val="1"/>
               <w14:checkedState w14:val="2612" w14:font="MS Gothic"/>
               <w14:uncheckedState w14:val="2610" w14:font="MS Gothic"/>
             </w14:checkbox>
@@ -5672,7 +5672,7 @@
                   <w:rPr>
                     <w:rFonts w:ascii="MS Gothic" w:eastAsia="MS Gothic" w:hAnsi="MS Gothic" w:cs="Arial" w:hint="eastAsia"/>
                   </w:rPr>
-                  <w:t>☐</w:t>
+                  <w:t>☒</w:t>
                 </w:r>
               </w:p>
             </w:tc>
@@ -5769,35 +5769,7 @@
           <w:noProof/>
           <w:sz w:val="24"/>
         </w:rPr>
-        <w:t> </w:t>
-      </w:r>
-      <w:r>
-        <w:rPr>
-          <w:noProof/>
-          <w:sz w:val="24"/>
-        </w:rPr>
-        <w:t> </w:t>
-      </w:r>
-      <w:r>
-        <w:rPr>
-          <w:noProof/>
-          <w:sz w:val="24"/>
-        </w:rPr>
-        <w:t> </w:t>
-      </w:r>
-      <w:r>
-        <w:rPr>
-          <w:noProof/>
-          <w:sz w:val="24"/>
-        </w:rPr>
-        <w:t> </w:t>
-      </w:r>
-      <w:r>
-        <w:rPr>
-          <w:noProof/>
-          <w:sz w:val="24"/>
-        </w:rPr>
-        <w:t> </w:t>
+        <w:t>3.12.2018</w:t>
       </w:r>
       <w:r>
         <w:rPr>
@@ -5864,35 +5836,7 @@
           <w:noProof/>
           <w:sz w:val="24"/>
         </w:rPr>
-        <w:t> </w:t>
-      </w:r>
-      <w:r>
-        <w:rPr>
-          <w:noProof/>
-          <w:sz w:val="24"/>
-        </w:rPr>
-        <w:t> </w:t>
-      </w:r>
-      <w:r>
-        <w:rPr>
-          <w:noProof/>
-          <w:sz w:val="24"/>
-        </w:rPr>
-        <w:t> </w:t>
-      </w:r>
-      <w:r>
-        <w:rPr>
-          <w:noProof/>
-          <w:sz w:val="24"/>
-        </w:rPr>
-        <w:t> </w:t>
-      </w:r>
-      <w:r>
-        <w:rPr>
-          <w:noProof/>
-          <w:sz w:val="24"/>
-        </w:rPr>
-        <w:t> </w:t>
+        <w:t>MQ</w:t>
       </w:r>
       <w:r>
         <w:rPr>
@@ -7160,7 +7104,7 @@
 </file>
 
 <file path=customXml/itemProps1.xml><?xml version="1.0" encoding="utf-8"?>
-<ds:datastoreItem xmlns:ds="http://schemas.openxmlformats.org/officeDocument/2006/customXml" ds:itemID="{75B5AFEE-7819-4773-97BD-72017EC7414B}">
+<ds:datastoreItem xmlns:ds="http://schemas.openxmlformats.org/officeDocument/2006/customXml" ds:itemID="{8A4C771D-1EDB-4297-BCCF-02FA1A9C6118}">
   <ds:schemaRefs>
     <ds:schemaRef ds:uri="http://schemas.openxmlformats.org/officeDocument/2006/bibliography"/>
   </ds:schemaRefs>

</xml_diff>